<commit_message>
fix: update audio pause threshold to 2.5 seconds
</commit_message>
<xml_diff>
--- a/generated_resume.docx
+++ b/generated_resume.docx
@@ -46,7 +46,7 @@
                 <w:color w:val="FFFFFF"/>
                 <w:sz w:val="32"/>
               </w:rPr>
-              <w:t>GONDA ZOLTÁN</w:t>
+              <w:t>GONDA MÓNIKA</w:t>
             </w:r>
           </w:p>
           <w:p>
@@ -116,7 +116,7 @@
               <w:rPr>
                 <w:color w:val="FFFFFF"/>
               </w:rPr>
-              <w:t>• Persistence</w:t>
+              <w:t>• Daily use of Menetrendes Firenze</w:t>
             </w:r>
           </w:p>
           <w:p>
@@ -127,7 +127,7 @@
               <w:rPr>
                 <w:color w:val="FFFFFF"/>
               </w:rPr>
-              <w:t>• Thoughtfulness</w:t>
+              <w:t>• Proficiency in Microsoft Office programs</w:t>
             </w:r>
           </w:p>
           <w:p>
@@ -138,7 +138,7 @@
               <w:rPr>
                 <w:color w:val="FFFFFF"/>
               </w:rPr>
-              <w:t>• Crochet</w:t>
+              <w:t>• Intermediate English language skills (written and spoken)</w:t>
             </w:r>
           </w:p>
           <w:p>
@@ -149,7 +149,18 @@
               <w:rPr>
                 <w:color w:val="FFFFFF"/>
               </w:rPr>
-              <w:t>• Hiking</w:t>
+              <w:t>• Intermediate German language skills (written and spoken)</w:t>
+            </w:r>
+          </w:p>
+          <w:p>
+            <w:pPr>
+              <w:ind w:left="283"/>
+            </w:pPr>
+            <w:r>
+              <w:rPr>
+                <w:color w:val="FFFFFF"/>
+              </w:rPr>
+              <w:t>• Interest in sports</w:t>
             </w:r>
           </w:p>
         </w:tc>
@@ -176,7 +187,7 @@
               <w:rPr>
                 <w:color w:val="000000"/>
               </w:rPr>
-              <w:t>A motivated student currently studying at Eötvös Loránd University with experience in retail positions. Strong skills in persistence and a determined approach to completing objectives.</w:t>
+              <w:t>A transportation engineer with experience as an internal sales assistant at Tech Kft. in Kecskemét from 2018 to 2023, demonstrating strong skills in transportation management and customer support.</w:t>
             </w:r>
           </w:p>
           <w:p>
@@ -207,13 +218,13 @@
                 <w:b/>
                 <w:color w:val="000000"/>
               </w:rPr>
-              <w:t>Cashier</w:t>
+              <w:t>Internal Sales Assistant</w:t>
             </w:r>
             <w:r>
               <w:rPr>
                 <w:color w:val="000000"/>
               </w:rPr>
-              <w:t>, McDonald's (Dates)</w:t>
+              <w:t>, Tech Kft. (2018 - 2023)</w:t>
             </w:r>
           </w:p>
           <w:p>
@@ -221,71 +232,7 @@
               <w:rPr>
                 <w:color w:val="000000"/>
               </w:rPr>
-              <w:t>Responsible for managing transactions and providing customer service.</w:t>
-            </w:r>
-          </w:p>
-          <w:p>
-            <w:pPr>
-              <w:ind w:left="283"/>
-            </w:pPr>
-            <w:r>
-              <w:rPr>
-                <w:color w:val="000000"/>
-              </w:rPr>
-              <w:t xml:space="preserve">• </w:t>
-            </w:r>
-            <w:r>
-              <w:rPr>
-                <w:b/>
-                <w:color w:val="000000"/>
-              </w:rPr>
-              <w:t>Sales Assistant</w:t>
-            </w:r>
-            <w:r>
-              <w:rPr>
-                <w:color w:val="000000"/>
-              </w:rPr>
-              <w:t>, Lidl (Dates)</w:t>
-            </w:r>
-          </w:p>
-          <w:p>
-            <w:r>
-              <w:rPr>
-                <w:color w:val="000000"/>
-              </w:rPr>
-              <w:t>Assisted customers and handled inventory management.</w:t>
-            </w:r>
-          </w:p>
-          <w:p>
-            <w:pPr>
-              <w:ind w:left="283"/>
-            </w:pPr>
-            <w:r>
-              <w:rPr>
-                <w:color w:val="000000"/>
-              </w:rPr>
-              <w:t xml:space="preserve">• </w:t>
-            </w:r>
-            <w:r>
-              <w:rPr>
-                <w:b/>
-                <w:color w:val="000000"/>
-              </w:rPr>
-              <w:t>Sales Assistant</w:t>
-            </w:r>
-            <w:r>
-              <w:rPr>
-                <w:color w:val="000000"/>
-              </w:rPr>
-              <w:t>, Spar (Dates)</w:t>
-            </w:r>
-          </w:p>
-          <w:p>
-            <w:r>
-              <w:rPr>
-                <w:color w:val="000000"/>
-              </w:rPr>
-              <w:t>Supported sales operations and customer inquiries.</w:t>
+              <w:t>Managed sales support and internal communications, contributing to the efficiency of the sales team and customer satisfaction.</w:t>
             </w:r>
           </w:p>
           <w:p>
@@ -316,37 +263,13 @@
                 <w:b/>
                 <w:color w:val="000000"/>
               </w:rPr>
-              <w:t>High School Diploma</w:t>
+              <w:t>Transportation Engineer</w:t>
             </w:r>
             <w:r>
               <w:rPr>
                 <w:color w:val="000000"/>
               </w:rPr>
-              <w:t>, Kecskeméti Katona József Gymnasium (Dates)</w:t>
-            </w:r>
-          </w:p>
-          <w:p>
-            <w:pPr>
-              <w:ind w:left="283"/>
-            </w:pPr>
-            <w:r>
-              <w:rPr>
-                <w:color w:val="000000"/>
-              </w:rPr>
-              <w:t xml:space="preserve">• </w:t>
-            </w:r>
-            <w:r>
-              <w:rPr>
-                <w:b/>
-                <w:color w:val="000000"/>
-              </w:rPr>
-              <w:t>Bachelor's Degree in Humanities</w:t>
-            </w:r>
-            <w:r>
-              <w:rPr>
-                <w:color w:val="000000"/>
-              </w:rPr>
-              <w:t>, Eötvös Loránd University (In progress)</w:t>
+              <w:t>, Széchenyi István University (Dates)</w:t>
             </w:r>
           </w:p>
         </w:tc>

</xml_diff>